<commit_message>
Update UA 1 – 3 assessments
</commit_message>
<xml_diff>
--- a/src/site/resources/understanding-autism-u1-assessment.docx
+++ b/src/site/resources/understanding-autism-u1-assessment.docx
@@ -172,7 +172,25 @@
           <w:sz w:val="24"/>
           <w:szCs w:val="24"/>
         </w:rPr>
-        <w:t xml:space="preserve"> questions which will assist you in answering the questions in the assessment. Try to answer the questions in the format requested i.e. </w:t>
+        <w:t xml:space="preserve"> questions which will assist you in answering the questions in the assessment. Try to answer the questions in the format requested </w:t>
+      </w:r>
+      <w:proofErr w:type="gramStart"/>
+      <w:r>
+        <w:rPr>
+          <w:rFonts w:ascii="Open Sans" w:hAnsi="Open Sans" w:cs="Open Sans"/>
+          <w:sz w:val="24"/>
+          <w:szCs w:val="24"/>
+        </w:rPr>
+        <w:t>i.e.</w:t>
+      </w:r>
+      <w:proofErr w:type="gramEnd"/>
+      <w:r>
+        <w:rPr>
+          <w:rFonts w:ascii="Open Sans" w:hAnsi="Open Sans" w:cs="Open Sans"/>
+          <w:sz w:val="24"/>
+          <w:szCs w:val="24"/>
+        </w:rPr>
+        <w:t xml:space="preserve"> </w:t>
       </w:r>
       <w:r>
         <w:rPr>
@@ -695,7 +713,45 @@
           <w:sz w:val="24"/>
           <w:szCs w:val="24"/>
         </w:rPr>
-        <w:t xml:space="preserve">If you are unsure of any questions you should refer back to the specific page number that covers the topic in the course materials.  </w:t>
+        <w:t xml:space="preserve">If you are unsure of any </w:t>
+      </w:r>
+      <w:r>
+        <w:rPr>
+          <w:rFonts w:ascii="Open Sans" w:hAnsi="Open Sans" w:cs="Open Sans"/>
+          <w:bCs/>
+          <w:sz w:val="24"/>
+          <w:szCs w:val="24"/>
+        </w:rPr>
+        <w:t>questions,</w:t>
+      </w:r>
+      <w:r>
+        <w:rPr>
+          <w:rFonts w:ascii="Open Sans" w:hAnsi="Open Sans" w:cs="Open Sans"/>
+          <w:bCs/>
+          <w:sz w:val="24"/>
+          <w:szCs w:val="24"/>
+        </w:rPr>
+        <w:t xml:space="preserve"> you should </w:t>
+      </w:r>
+      <w:proofErr w:type="gramStart"/>
+      <w:r>
+        <w:rPr>
+          <w:rFonts w:ascii="Open Sans" w:hAnsi="Open Sans" w:cs="Open Sans"/>
+          <w:bCs/>
+          <w:sz w:val="24"/>
+          <w:szCs w:val="24"/>
+        </w:rPr>
+        <w:t>refer back</w:t>
+      </w:r>
+      <w:proofErr w:type="gramEnd"/>
+      <w:r>
+        <w:rPr>
+          <w:rFonts w:ascii="Open Sans" w:hAnsi="Open Sans" w:cs="Open Sans"/>
+          <w:bCs/>
+          <w:sz w:val="24"/>
+          <w:szCs w:val="24"/>
+        </w:rPr>
+        <w:t xml:space="preserve"> to the specific page number that covers the topic in the course materials.  </w:t>
       </w:r>
     </w:p>
     <w:p>
@@ -1404,6 +1460,12 @@
             <w:r>
               <w:rPr>
                 <w:rFonts w:ascii="Open Sans" w:hAnsi="Open Sans" w:cs="Open Sans"/>
+              </w:rPr>
+              <w:t xml:space="preserve"> </w:t>
+            </w:r>
+            <w:r>
+              <w:rPr>
+                <w:rFonts w:ascii="Open Sans" w:hAnsi="Open Sans" w:cs="Open Sans"/>
                 <w:spacing w:val="-58"/>
               </w:rPr>
               <w:t xml:space="preserve"> </w:t>
@@ -2594,6 +2656,7 @@
           <w:sz w:val="24"/>
           <w:szCs w:val="24"/>
         </w:rPr>
+        <w:lastRenderedPageBreak/>
         <w:t>3</w:t>
       </w:r>
       <w:r>
@@ -2882,7 +2945,45 @@
           <w:sz w:val="24"/>
           <w:szCs w:val="24"/>
         </w:rPr>
-        <w:t xml:space="preserve">If you are unsure of any questions you should refer back to the specific page number that covers the topic.  </w:t>
+        <w:t xml:space="preserve">If you are unsure of any </w:t>
+      </w:r>
+      <w:r>
+        <w:rPr>
+          <w:rFonts w:ascii="Open Sans" w:hAnsi="Open Sans" w:cs="Open Sans"/>
+          <w:bCs/>
+          <w:sz w:val="24"/>
+          <w:szCs w:val="24"/>
+        </w:rPr>
+        <w:t>questions,</w:t>
+      </w:r>
+      <w:r>
+        <w:rPr>
+          <w:rFonts w:ascii="Open Sans" w:hAnsi="Open Sans" w:cs="Open Sans"/>
+          <w:bCs/>
+          <w:sz w:val="24"/>
+          <w:szCs w:val="24"/>
+        </w:rPr>
+        <w:t xml:space="preserve"> you should </w:t>
+      </w:r>
+      <w:proofErr w:type="gramStart"/>
+      <w:r>
+        <w:rPr>
+          <w:rFonts w:ascii="Open Sans" w:hAnsi="Open Sans" w:cs="Open Sans"/>
+          <w:bCs/>
+          <w:sz w:val="24"/>
+          <w:szCs w:val="24"/>
+        </w:rPr>
+        <w:t>refer back</w:t>
+      </w:r>
+      <w:proofErr w:type="gramEnd"/>
+      <w:r>
+        <w:rPr>
+          <w:rFonts w:ascii="Open Sans" w:hAnsi="Open Sans" w:cs="Open Sans"/>
+          <w:bCs/>
+          <w:sz w:val="24"/>
+          <w:szCs w:val="24"/>
+        </w:rPr>
+        <w:t xml:space="preserve"> to the specific page number that covers the topic.  </w:t>
       </w:r>
     </w:p>
     <w:tbl>
@@ -3057,14 +3158,13 @@
               <w:rPr>
                 <w:rFonts w:ascii="Open Sans" w:hAnsi="Open Sans" w:cs="Open Sans"/>
               </w:rPr>
-              <w:t xml:space="preserve"> the following theoretical</w:t>
-            </w:r>
-            <w:r>
-              <w:rPr>
-                <w:rFonts w:ascii="Open Sans" w:hAnsi="Open Sans" w:cs="Open Sans"/>
-                <w:spacing w:val="-60"/>
-              </w:rPr>
-              <w:t xml:space="preserve">       </w:t>
+              <w:t xml:space="preserve"> the following theoretica</w:t>
+            </w:r>
+            <w:r>
+              <w:rPr>
+                <w:rFonts w:ascii="Open Sans" w:hAnsi="Open Sans" w:cs="Open Sans"/>
+              </w:rPr>
+              <w:t xml:space="preserve">l </w:t>
             </w:r>
             <w:r>
               <w:rPr>
@@ -3112,12 +3212,14 @@
                 <w:rFonts w:ascii="Open Sans" w:hAnsi="Open Sans" w:cs="Open Sans"/>
               </w:rPr>
             </w:pPr>
+            <w:proofErr w:type="spellStart"/>
             <w:r>
               <w:rPr>
                 <w:rFonts w:ascii="Open Sans" w:hAnsi="Open Sans" w:cs="Open Sans"/>
               </w:rPr>
               <w:t>Kanner</w:t>
             </w:r>
+            <w:proofErr w:type="spellEnd"/>
           </w:p>
           <w:p>
             <w:pPr>
@@ -3483,6 +3585,7 @@
           <w:sz w:val="24"/>
           <w:szCs w:val="24"/>
         </w:rPr>
+        <w:lastRenderedPageBreak/>
         <w:t>1</w:t>
       </w:r>
       <w:r>
@@ -3676,6 +3779,7 @@
                 <w:szCs w:val="24"/>
               </w:rPr>
             </w:pPr>
+            <w:proofErr w:type="spellStart"/>
             <w:r>
               <w:rPr>
                 <w:rFonts w:ascii="Open Sans" w:hAnsi="Open Sans" w:cs="Open Sans"/>
@@ -3686,6 +3790,7 @@
               </w:rPr>
               <w:t>Kanner</w:t>
             </w:r>
+            <w:proofErr w:type="spellEnd"/>
           </w:p>
           <w:p>
             <w:pPr>
@@ -4241,6 +4346,7 @@
           <w:sz w:val="40"/>
           <w:szCs w:val="40"/>
         </w:rPr>
+        <w:lastRenderedPageBreak/>
         <w:t>Section 3: Know how autism is diagnosed</w:t>
       </w:r>
       <w:r>
@@ -4317,7 +4423,45 @@
           <w:sz w:val="24"/>
           <w:szCs w:val="24"/>
         </w:rPr>
-        <w:t>If you are unsure of any questions you should refer back to the specific page number that covers the topic.</w:t>
+        <w:t xml:space="preserve">If you are unsure of any </w:t>
+      </w:r>
+      <w:r>
+        <w:rPr>
+          <w:rFonts w:ascii="Open Sans" w:hAnsi="Open Sans" w:cs="Open Sans"/>
+          <w:b/>
+          <w:sz w:val="24"/>
+          <w:szCs w:val="24"/>
+        </w:rPr>
+        <w:t>questions,</w:t>
+      </w:r>
+      <w:r>
+        <w:rPr>
+          <w:rFonts w:ascii="Open Sans" w:hAnsi="Open Sans" w:cs="Open Sans"/>
+          <w:b/>
+          <w:sz w:val="24"/>
+          <w:szCs w:val="24"/>
+        </w:rPr>
+        <w:t xml:space="preserve"> you should </w:t>
+      </w:r>
+      <w:proofErr w:type="gramStart"/>
+      <w:r>
+        <w:rPr>
+          <w:rFonts w:ascii="Open Sans" w:hAnsi="Open Sans" w:cs="Open Sans"/>
+          <w:b/>
+          <w:sz w:val="24"/>
+          <w:szCs w:val="24"/>
+        </w:rPr>
+        <w:t>refer back</w:t>
+      </w:r>
+      <w:proofErr w:type="gramEnd"/>
+      <w:r>
+        <w:rPr>
+          <w:rFonts w:ascii="Open Sans" w:hAnsi="Open Sans" w:cs="Open Sans"/>
+          <w:b/>
+          <w:sz w:val="24"/>
+          <w:szCs w:val="24"/>
+        </w:rPr>
+        <w:t xml:space="preserve"> to the specific page number that covers the topic.</w:t>
       </w:r>
     </w:p>
     <w:p>
@@ -4757,6 +4901,12 @@
             <w:r>
               <w:rPr>
                 <w:rFonts w:ascii="Open Sans" w:hAnsi="Open Sans" w:cs="Open Sans"/>
+              </w:rPr>
+              <w:t xml:space="preserve"> </w:t>
+            </w:r>
+            <w:r>
+              <w:rPr>
+                <w:rFonts w:ascii="Open Sans" w:hAnsi="Open Sans" w:cs="Open Sans"/>
                 <w:spacing w:val="-59"/>
               </w:rPr>
               <w:t xml:space="preserve"> </w:t>
@@ -4937,6 +5087,12 @@
             <w:r>
               <w:rPr>
                 <w:rFonts w:ascii="Open Sans" w:hAnsi="Open Sans" w:cs="Open Sans"/>
+              </w:rPr>
+              <w:t xml:space="preserve"> </w:t>
+            </w:r>
+            <w:r>
+              <w:rPr>
+                <w:rFonts w:ascii="Open Sans" w:hAnsi="Open Sans" w:cs="Open Sans"/>
                 <w:spacing w:val="-59"/>
               </w:rPr>
               <w:t xml:space="preserve"> </w:t>
@@ -5132,6 +5288,12 @@
                 <w:rFonts w:ascii="Open Sans" w:hAnsi="Open Sans" w:cs="Open Sans"/>
               </w:rPr>
               <w:t xml:space="preserve"> why it is important for</w:t>
+            </w:r>
+            <w:r>
+              <w:rPr>
+                <w:rFonts w:ascii="Open Sans" w:hAnsi="Open Sans" w:cs="Open Sans"/>
+              </w:rPr>
+              <w:t xml:space="preserve"> </w:t>
             </w:r>
             <w:r>
               <w:rPr>
@@ -6747,7 +6909,45 @@
           <w:sz w:val="24"/>
           <w:szCs w:val="24"/>
         </w:rPr>
-        <w:t xml:space="preserve">If you are unsure of any questions you should refer back to the specific page number that covers the topic in the course materials.  </w:t>
+        <w:t xml:space="preserve">If you are unsure of any </w:t>
+      </w:r>
+      <w:r>
+        <w:rPr>
+          <w:rFonts w:ascii="Open Sans" w:hAnsi="Open Sans" w:cs="Open Sans"/>
+          <w:bCs/>
+          <w:sz w:val="24"/>
+          <w:szCs w:val="24"/>
+        </w:rPr>
+        <w:t>questions,</w:t>
+      </w:r>
+      <w:r>
+        <w:rPr>
+          <w:rFonts w:ascii="Open Sans" w:hAnsi="Open Sans" w:cs="Open Sans"/>
+          <w:bCs/>
+          <w:sz w:val="24"/>
+          <w:szCs w:val="24"/>
+        </w:rPr>
+        <w:t xml:space="preserve"> you should </w:t>
+      </w:r>
+      <w:proofErr w:type="gramStart"/>
+      <w:r>
+        <w:rPr>
+          <w:rFonts w:ascii="Open Sans" w:hAnsi="Open Sans" w:cs="Open Sans"/>
+          <w:bCs/>
+          <w:sz w:val="24"/>
+          <w:szCs w:val="24"/>
+        </w:rPr>
+        <w:t>refer back</w:t>
+      </w:r>
+      <w:proofErr w:type="gramEnd"/>
+      <w:r>
+        <w:rPr>
+          <w:rFonts w:ascii="Open Sans" w:hAnsi="Open Sans" w:cs="Open Sans"/>
+          <w:bCs/>
+          <w:sz w:val="24"/>
+          <w:szCs w:val="24"/>
+        </w:rPr>
+        <w:t xml:space="preserve"> to the specific page number that covers the topic in the course materials.  </w:t>
       </w:r>
     </w:p>
     <w:p>
@@ -7239,7 +7439,52 @@
                 <w:sz w:val="24"/>
                 <w:szCs w:val="24"/>
               </w:rPr>
-              <w:t>4.3. Outline what is meant by the ‘triad of impairments’.</w:t>
+              <w:t xml:space="preserve">4.3. Outline what is meant by the </w:t>
+            </w:r>
+            <w:r>
+              <w:rPr>
+                <w:rFonts w:ascii="Open Sans" w:hAnsi="Open Sans" w:cs="Open Sans"/>
+                <w:bCs/>
+                <w:sz w:val="24"/>
+                <w:szCs w:val="24"/>
+              </w:rPr>
+              <w:t>“</w:t>
+            </w:r>
+            <w:r>
+              <w:rPr>
+                <w:rFonts w:ascii="Open Sans" w:hAnsi="Open Sans" w:cs="Open Sans"/>
+                <w:bCs/>
+                <w:sz w:val="24"/>
+                <w:szCs w:val="24"/>
+              </w:rPr>
+              <w:t xml:space="preserve">triad of </w:t>
+            </w:r>
+            <w:r>
+              <w:rPr>
+                <w:rFonts w:ascii="Open Sans" w:hAnsi="Open Sans" w:cs="Open Sans"/>
+                <w:bCs/>
+                <w:sz w:val="24"/>
+                <w:szCs w:val="24"/>
+              </w:rPr>
+              <w:t>impairments</w:t>
+            </w:r>
+            <w:r>
+              <w:rPr>
+                <w:rFonts w:ascii="Open Sans" w:hAnsi="Open Sans" w:cs="Open Sans"/>
+                <w:bCs/>
+                <w:sz w:val="24"/>
+                <w:szCs w:val="24"/>
+              </w:rPr>
+              <w:t>”</w:t>
+            </w:r>
+            <w:r>
+              <w:rPr>
+                <w:rFonts w:ascii="Open Sans" w:hAnsi="Open Sans" w:cs="Open Sans"/>
+                <w:bCs/>
+                <w:sz w:val="24"/>
+                <w:szCs w:val="24"/>
+              </w:rPr>
+              <w:t>.</w:t>
             </w:r>
           </w:p>
           <w:p>
@@ -7333,14 +7578,7 @@
                 <w:rFonts w:ascii="Open Sans" w:hAnsi="Open Sans" w:cs="Open Sans"/>
                 <w:bCs/>
               </w:rPr>
-              <w:t xml:space="preserve">Session 4 page </w:t>
-            </w:r>
-            <w:r>
-              <w:rPr>
-                <w:rFonts w:ascii="Open Sans" w:hAnsi="Open Sans" w:cs="Open Sans"/>
-                <w:bCs/>
-              </w:rPr>
-              <w:t>2</w:t>
+              <w:t>Session 4 page 2</w:t>
             </w:r>
           </w:p>
         </w:tc>
@@ -7470,14 +7708,7 @@
                 <w:rFonts w:ascii="Open Sans" w:hAnsi="Open Sans" w:cs="Open Sans"/>
                 <w:bCs/>
               </w:rPr>
-              <w:t xml:space="preserve">Session 4 page </w:t>
-            </w:r>
-            <w:r>
-              <w:rPr>
-                <w:rFonts w:ascii="Open Sans" w:hAnsi="Open Sans" w:cs="Open Sans"/>
-                <w:bCs/>
-              </w:rPr>
-              <w:t>2</w:t>
+              <w:t>Session 4 page 2</w:t>
             </w:r>
           </w:p>
         </w:tc>
@@ -8010,8 +8241,18 @@
           <w:sz w:val="24"/>
           <w:szCs w:val="24"/>
         </w:rPr>
-        <w:t>what is meant by the ‘triad of impairments’</w:t>
-      </w:r>
+        <w:t xml:space="preserve">what is meant by the ‘triad of </w:t>
+      </w:r>
+      <w:proofErr w:type="gramStart"/>
+      <w:r>
+        <w:rPr>
+          <w:rFonts w:ascii="Open Sans" w:hAnsi="Open Sans" w:cs="Open Sans"/>
+          <w:sz w:val="24"/>
+          <w:szCs w:val="24"/>
+        </w:rPr>
+        <w:t>impairments’</w:t>
+      </w:r>
+      <w:proofErr w:type="gramEnd"/>
       <w:r>
         <w:rPr>
           <w:rFonts w:ascii="Open Sans" w:hAnsi="Open Sans" w:cs="Open Sans"/>
@@ -8624,7 +8865,45 @@
           <w:sz w:val="24"/>
           <w:szCs w:val="24"/>
         </w:rPr>
-        <w:t>If you are unsure of any questions you should refer back to the specific page number that covers the topic.</w:t>
+        <w:t xml:space="preserve">If you are unsure of any </w:t>
+      </w:r>
+      <w:r>
+        <w:rPr>
+          <w:rFonts w:ascii="Open Sans" w:hAnsi="Open Sans" w:cs="Open Sans"/>
+          <w:bCs/>
+          <w:sz w:val="24"/>
+          <w:szCs w:val="24"/>
+        </w:rPr>
+        <w:t>questions,</w:t>
+      </w:r>
+      <w:r>
+        <w:rPr>
+          <w:rFonts w:ascii="Open Sans" w:hAnsi="Open Sans" w:cs="Open Sans"/>
+          <w:bCs/>
+          <w:sz w:val="24"/>
+          <w:szCs w:val="24"/>
+        </w:rPr>
+        <w:t xml:space="preserve"> you should </w:t>
+      </w:r>
+      <w:proofErr w:type="gramStart"/>
+      <w:r>
+        <w:rPr>
+          <w:rFonts w:ascii="Open Sans" w:hAnsi="Open Sans" w:cs="Open Sans"/>
+          <w:bCs/>
+          <w:sz w:val="24"/>
+          <w:szCs w:val="24"/>
+        </w:rPr>
+        <w:t>refer back</w:t>
+      </w:r>
+      <w:proofErr w:type="gramEnd"/>
+      <w:r>
+        <w:rPr>
+          <w:rFonts w:ascii="Open Sans" w:hAnsi="Open Sans" w:cs="Open Sans"/>
+          <w:bCs/>
+          <w:sz w:val="24"/>
+          <w:szCs w:val="24"/>
+        </w:rPr>
+        <w:t xml:space="preserve"> to the specific page number that covers the topic.</w:t>
       </w:r>
     </w:p>
     <w:tbl>
@@ -8785,14 +9064,13 @@
               <w:rPr>
                 <w:rFonts w:ascii="Open Sans" w:hAnsi="Open Sans" w:cs="Open Sans"/>
               </w:rPr>
-              <w:t xml:space="preserve"> the following conditions</w:t>
-            </w:r>
-            <w:r>
-              <w:rPr>
-                <w:rFonts w:ascii="Open Sans" w:hAnsi="Open Sans" w:cs="Open Sans"/>
-                <w:spacing w:val="-60"/>
-              </w:rPr>
-              <w:t xml:space="preserve"> </w:t>
+              <w:t xml:space="preserve"> the following condition</w:t>
+            </w:r>
+            <w:r>
+              <w:rPr>
+                <w:rFonts w:ascii="Open Sans" w:hAnsi="Open Sans" w:cs="Open Sans"/>
+              </w:rPr>
+              <w:t xml:space="preserve">s </w:t>
             </w:r>
             <w:r>
               <w:rPr>
@@ -8883,6 +9161,7 @@
               <w:rPr>
                 <w:rFonts w:ascii="Open Sans" w:hAnsi="Open Sans" w:cs="Open Sans"/>
               </w:rPr>
+              <w:lastRenderedPageBreak/>
               <w:t>mental</w:t>
             </w:r>
             <w:r>
@@ -8963,6 +9242,7 @@
                 <w:rFonts w:ascii="Open Sans" w:hAnsi="Open Sans" w:cs="Open Sans"/>
                 <w:bCs/>
               </w:rPr>
+              <w:lastRenderedPageBreak/>
               <w:t>Question 1</w:t>
             </w:r>
           </w:p>
@@ -10198,7 +10478,45 @@
           <w:sz w:val="24"/>
           <w:szCs w:val="24"/>
         </w:rPr>
-        <w:t>If you are unsure of any questions you should refer back to the specific page number that covers the topic.</w:t>
+        <w:t xml:space="preserve">If you are unsure of any </w:t>
+      </w:r>
+      <w:r>
+        <w:rPr>
+          <w:rFonts w:ascii="Open Sans" w:hAnsi="Open Sans" w:cs="Open Sans"/>
+          <w:bCs/>
+          <w:sz w:val="24"/>
+          <w:szCs w:val="24"/>
+        </w:rPr>
+        <w:t>questions,</w:t>
+      </w:r>
+      <w:r>
+        <w:rPr>
+          <w:rFonts w:ascii="Open Sans" w:hAnsi="Open Sans" w:cs="Open Sans"/>
+          <w:bCs/>
+          <w:sz w:val="24"/>
+          <w:szCs w:val="24"/>
+        </w:rPr>
+        <w:t xml:space="preserve"> you should </w:t>
+      </w:r>
+      <w:proofErr w:type="gramStart"/>
+      <w:r>
+        <w:rPr>
+          <w:rFonts w:ascii="Open Sans" w:hAnsi="Open Sans" w:cs="Open Sans"/>
+          <w:bCs/>
+          <w:sz w:val="24"/>
+          <w:szCs w:val="24"/>
+        </w:rPr>
+        <w:t>refer back</w:t>
+      </w:r>
+      <w:proofErr w:type="gramEnd"/>
+      <w:r>
+        <w:rPr>
+          <w:rFonts w:ascii="Open Sans" w:hAnsi="Open Sans" w:cs="Open Sans"/>
+          <w:bCs/>
+          <w:sz w:val="24"/>
+          <w:szCs w:val="24"/>
+        </w:rPr>
+        <w:t xml:space="preserve"> to the specific page number that covers the topic.</w:t>
       </w:r>
     </w:p>
     <w:tbl>
@@ -10878,18 +11196,6 @@
             <w:tcW w:w="9918" w:type="dxa"/>
             <w:shd w:val="clear" w:color="auto" w:fill="auto"/>
           </w:tcPr>
-          <w:p>
-            <w:pPr>
-              <w:pStyle w:val="Header"/>
-              <w:rPr>
-                <w:rFonts w:ascii="Open Sans" w:hAnsi="Open Sans" w:cs="Open Sans"/>
-                <w:b/>
-                <w:color w:val="FF7926"/>
-                <w:sz w:val="24"/>
-                <w:szCs w:val="24"/>
-              </w:rPr>
-            </w:pPr>
-          </w:p>
           <w:p>
             <w:pPr>
               <w:pStyle w:val="Header"/>

</xml_diff>